<commit_message>
archivos formato qms inspecciones
</commit_message>
<xml_diff>
--- a/public/templates/Reporte No conformidad Inspec Entrada.docx
+++ b/public/templates/Reporte No conformidad Inspec Entrada.docx
@@ -1531,9 +1531,6 @@
             <w:pPr>
               <w:rPr>
                 <w:rFonts w:ascii="Arial Nova" w:hAnsi="Arial Nova"/>
-                <w:i/>
-                <w:iCs/>
-                <w:color w:val="4472C4" w:themeColor="accent1"/>
                 <w:sz w:val="21"/>
                 <w:szCs w:val="21"/>
                 <w:lang w:val="es-MX"/>
@@ -1542,9 +1539,6 @@
             <w:r>
               <w:rPr>
                 <w:rFonts w:ascii="Arial Nova" w:hAnsi="Arial Nova"/>
-                <w:i/>
-                <w:iCs/>
-                <w:color w:val="4472C4" w:themeColor="accent1"/>
                 <w:sz w:val="21"/>
                 <w:szCs w:val="21"/>
                 <w:lang w:val="es-MX"/>
@@ -1555,9 +1549,6 @@
             <w:r>
               <w:rPr>
                 <w:rFonts w:ascii="Arial Nova" w:hAnsi="Arial Nova"/>
-                <w:i/>
-                <w:iCs/>
-                <w:color w:val="4472C4" w:themeColor="accent1"/>
                 <w:sz w:val="21"/>
                 <w:szCs w:val="21"/>
                 <w:lang w:val="es-MX"/>
@@ -1568,9 +1559,6 @@
             <w:r>
               <w:rPr>
                 <w:rFonts w:ascii="Arial Nova" w:hAnsi="Arial Nova"/>
-                <w:i/>
-                <w:iCs/>
-                <w:color w:val="4472C4" w:themeColor="accent1"/>
                 <w:sz w:val="21"/>
                 <w:szCs w:val="21"/>
                 <w:lang w:val="es-MX"/>
@@ -1582,9 +1570,6 @@
             <w:pPr>
               <w:rPr>
                 <w:rFonts w:ascii="Arial Nova" w:hAnsi="Arial Nova"/>
-                <w:i/>
-                <w:iCs/>
-                <w:color w:val="4472C4" w:themeColor="accent1"/>
                 <w:sz w:val="21"/>
                 <w:szCs w:val="21"/>
                 <w:lang w:val="es-MX"/>
@@ -1600,9 +1585,6 @@
             <w:r>
               <w:rPr>
                 <w:rFonts w:ascii="Arial Nova" w:hAnsi="Arial Nova"/>
-                <w:i/>
-                <w:iCs/>
-                <w:color w:val="4472C4" w:themeColor="accent1"/>
                 <w:sz w:val="21"/>
                 <w:szCs w:val="21"/>
                 <w:lang w:val="es-MX"/>
@@ -1613,9 +1595,6 @@
             <w:r>
               <w:rPr>
                 <w:rFonts w:ascii="Arial Nova" w:hAnsi="Arial Nova"/>
-                <w:i/>
-                <w:iCs/>
-                <w:color w:val="4472C4" w:themeColor="accent1"/>
                 <w:sz w:val="21"/>
                 <w:szCs w:val="21"/>
                 <w:lang w:val="es-MX"/>
@@ -1626,9 +1605,6 @@
             <w:r>
               <w:rPr>
                 <w:rFonts w:ascii="Arial Nova" w:hAnsi="Arial Nova"/>
-                <w:i/>
-                <w:iCs/>
-                <w:color w:val="4472C4" w:themeColor="accent1"/>
                 <w:sz w:val="21"/>
                 <w:szCs w:val="21"/>
                 <w:lang w:val="es-MX"/>
@@ -2214,32 +2190,27 @@
                 <w:rFonts w:ascii="Arial Nova" w:hAnsi="Arial Nova"/>
               </w:rPr>
             </w:pPr>
-            <w:r>
-              <w:rPr>
-                <w:rFonts w:ascii="Arial Nova" w:hAnsi="Arial Nova"/>
-              </w:rPr>
-              <w:t>{</w:t>
-            </w:r>
-            <w:proofErr w:type="spellStart"/>
-            <w:r>
-              <w:rPr>
-                <w:rFonts w:ascii="Arial Nova" w:hAnsi="Arial Nova"/>
-              </w:rPr>
-              <w:t>riskHigh</w:t>
-            </w:r>
-            <w:proofErr w:type="spellEnd"/>
-            <w:r>
-              <w:rPr>
-                <w:rFonts w:ascii="Arial Nova" w:hAnsi="Arial Nova"/>
-              </w:rPr>
-              <w:t>}</w:t>
-            </w:r>
-            <w:r>
-              <w:rPr>
-                <w:rFonts w:ascii="Arial Nova" w:hAnsi="Arial Nova"/>
-              </w:rPr>
-              <w:t xml:space="preserve"> </w:t>
-            </w:r>
+            <w:sdt>
+              <w:sdtPr>
+                <w:rPr>
+                  <w:rFonts w:ascii="Arial Nova" w:hAnsi="Arial Nova"/>
+                </w:rPr>
+                <w:id w:val="-1550532095"/>
+                <w14:checkbox>
+                  <w14:checked w14:val="0"/>
+                  <w14:checkedState w14:val="2612" w14:font="MS Gothic"/>
+                  <w14:uncheckedState w14:val="2610" w14:font="MS Gothic"/>
+                </w14:checkbox>
+              </w:sdtPr>
+              <w:sdtContent>
+                <w:r>
+                  <w:rPr>
+                    <w:rFonts w:ascii="MS Gothic" w:eastAsia="MS Gothic" w:hAnsi="MS Gothic" w:hint="eastAsia"/>
+                  </w:rPr>
+                  <w:t>☐</w:t>
+                </w:r>
+              </w:sdtContent>
+            </w:sdt>
             <w:r>
               <w:rPr>
                 <w:rFonts w:ascii="Arial Nova" w:hAnsi="Arial Nova"/>
@@ -2273,32 +2244,27 @@
                 <w:rFonts w:ascii="Arial Nova" w:hAnsi="Arial Nova"/>
               </w:rPr>
             </w:pPr>
-            <w:r>
-              <w:rPr>
-                <w:rFonts w:ascii="Arial Nova" w:hAnsi="Arial Nova"/>
-              </w:rPr>
-              <w:t>{</w:t>
-            </w:r>
-            <w:proofErr w:type="spellStart"/>
-            <w:r>
-              <w:rPr>
-                <w:rFonts w:ascii="Arial Nova" w:hAnsi="Arial Nova"/>
-              </w:rPr>
-              <w:t>riskMedium</w:t>
-            </w:r>
-            <w:proofErr w:type="spellEnd"/>
-            <w:r>
-              <w:rPr>
-                <w:rFonts w:ascii="Arial Nova" w:hAnsi="Arial Nova"/>
-              </w:rPr>
-              <w:t>}</w:t>
-            </w:r>
-            <w:r>
-              <w:rPr>
-                <w:rFonts w:ascii="Arial Nova" w:hAnsi="Arial Nova"/>
-              </w:rPr>
-              <w:t xml:space="preserve"> </w:t>
-            </w:r>
+            <w:sdt>
+              <w:sdtPr>
+                <w:rPr>
+                  <w:rFonts w:ascii="Arial Nova" w:hAnsi="Arial Nova"/>
+                </w:rPr>
+                <w:id w:val="-969599"/>
+                <w14:checkbox>
+                  <w14:checked w14:val="0"/>
+                  <w14:checkedState w14:val="2612" w14:font="MS Gothic"/>
+                  <w14:uncheckedState w14:val="2610" w14:font="MS Gothic"/>
+                </w14:checkbox>
+              </w:sdtPr>
+              <w:sdtContent>
+                <w:r>
+                  <w:rPr>
+                    <w:rFonts w:ascii="MS Gothic" w:eastAsia="MS Gothic" w:hAnsi="MS Gothic" w:hint="eastAsia"/>
+                  </w:rPr>
+                  <w:t>☐</w:t>
+                </w:r>
+              </w:sdtContent>
+            </w:sdt>
             <w:r>
               <w:rPr>
                 <w:rFonts w:ascii="Arial Nova" w:hAnsi="Arial Nova"/>
@@ -2332,32 +2298,27 @@
                 <w:rFonts w:ascii="Arial Nova" w:hAnsi="Arial Nova"/>
               </w:rPr>
             </w:pPr>
-            <w:r>
-              <w:rPr>
-                <w:rFonts w:ascii="Arial Nova" w:hAnsi="Arial Nova"/>
-              </w:rPr>
-              <w:t>{</w:t>
-            </w:r>
-            <w:proofErr w:type="spellStart"/>
-            <w:r>
-              <w:rPr>
-                <w:rFonts w:ascii="Arial Nova" w:hAnsi="Arial Nova"/>
-              </w:rPr>
-              <w:t>riskLow</w:t>
-            </w:r>
-            <w:proofErr w:type="spellEnd"/>
-            <w:r>
-              <w:rPr>
-                <w:rFonts w:ascii="Arial Nova" w:hAnsi="Arial Nova"/>
-              </w:rPr>
-              <w:t>}</w:t>
-            </w:r>
-            <w:r>
-              <w:rPr>
-                <w:rFonts w:ascii="Arial Nova" w:hAnsi="Arial Nova"/>
-              </w:rPr>
-              <w:t xml:space="preserve"> </w:t>
-            </w:r>
+            <w:sdt>
+              <w:sdtPr>
+                <w:rPr>
+                  <w:rFonts w:ascii="Arial Nova" w:hAnsi="Arial Nova"/>
+                </w:rPr>
+                <w:id w:val="-1741704896"/>
+                <w14:checkbox>
+                  <w14:checked w14:val="0"/>
+                  <w14:checkedState w14:val="2612" w14:font="MS Gothic"/>
+                  <w14:uncheckedState w14:val="2610" w14:font="MS Gothic"/>
+                </w14:checkbox>
+              </w:sdtPr>
+              <w:sdtContent>
+                <w:r>
+                  <w:rPr>
+                    <w:rFonts w:ascii="MS Gothic" w:eastAsia="MS Gothic" w:hAnsi="MS Gothic" w:hint="eastAsia"/>
+                  </w:rPr>
+                  <w:t>☐</w:t>
+                </w:r>
+              </w:sdtContent>
+            </w:sdt>
             <w:r>
               <w:rPr>
                 <w:rFonts w:ascii="Arial Nova" w:hAnsi="Arial Nova"/>
@@ -2403,28 +2364,43 @@
               <w:rPr>
                 <w:rFonts w:ascii="Arial Nova" w:hAnsi="Arial Nova"/>
               </w:rPr>
-              <w:t>{</w:t>
-            </w:r>
-            <w:proofErr w:type="spellStart"/>
-            <w:r>
-              <w:rPr>
-                <w:rFonts w:ascii="Arial Nova" w:hAnsi="Arial Nova"/>
-              </w:rPr>
-              <w:t>capaYes</w:t>
-            </w:r>
-            <w:proofErr w:type="spellEnd"/>
-            <w:r>
-              <w:rPr>
-                <w:rFonts w:ascii="Arial Nova" w:hAnsi="Arial Nova"/>
-              </w:rPr>
-              <w:t>}</w:t>
-            </w:r>
-            <w:r>
-              <w:rPr>
-                <w:rFonts w:ascii="Arial Nova" w:hAnsi="Arial Nova"/>
-              </w:rPr>
-              <w:t xml:space="preserve"> </w:t>
-            </w:r>
+              <w:fldChar w:fldCharType="begin">
+                <w:ffData>
+                  <w:name w:val="Check1"/>
+                  <w:enabled/>
+                  <w:calcOnExit w:val="0"/>
+                  <w:checkBox>
+                    <w:sizeAuto/>
+                    <w:default w:val="0"/>
+                  </w:checkBox>
+                </w:ffData>
+              </w:fldChar>
+            </w:r>
+            <w:bookmarkStart w:id="0" w:name="Check1"/>
+            <w:r>
+              <w:rPr>
+                <w:rFonts w:ascii="Arial Nova" w:hAnsi="Arial Nova"/>
+              </w:rPr>
+              <w:instrText xml:space="preserve"> FORMCHECKBOX </w:instrText>
+            </w:r>
+            <w:r>
+              <w:rPr>
+                <w:rFonts w:ascii="Arial Nova" w:hAnsi="Arial Nova"/>
+              </w:rPr>
+            </w:r>
+            <w:r>
+              <w:rPr>
+                <w:rFonts w:ascii="Arial Nova" w:hAnsi="Arial Nova"/>
+              </w:rPr>
+              <w:fldChar w:fldCharType="separate"/>
+            </w:r>
+            <w:r>
+              <w:rPr>
+                <w:rFonts w:ascii="Arial Nova" w:hAnsi="Arial Nova"/>
+              </w:rPr>
+              <w:fldChar w:fldCharType="end"/>
+            </w:r>
+            <w:bookmarkEnd w:id="0"/>
             <w:r>
               <w:rPr>
                 <w:rFonts w:ascii="Arial Nova" w:hAnsi="Arial Nova"/>
@@ -2439,126 +2415,53 @@
             <w:vMerge w:val="restart"/>
             <w:vAlign w:val="center"/>
           </w:tcPr>
-          <w:tbl>
-            <w:tblPr>
-              <w:tblW w:w="0" w:type="auto"/>
-              <w:tblCellSpacing w:w="15" w:type="dxa"/>
-              <w:tblCellMar>
-                <w:top w:w="15" w:type="dxa"/>
-                <w:left w:w="15" w:type="dxa"/>
-                <w:bottom w:w="15" w:type="dxa"/>
-                <w:right w:w="15" w:type="dxa"/>
-              </w:tblCellMar>
-              <w:tblLook w:val="04A0" w:firstRow="1" w:lastRow="0" w:firstColumn="1" w:lastColumn="0" w:noHBand="0" w:noVBand="1"/>
-            </w:tblPr>
-            <w:tblGrid>
-              <w:gridCol w:w="110"/>
-            </w:tblGrid>
-            <w:tr>
-              <w:trPr>
-                <w:tblCellSpacing w:w="15" w:type="dxa"/>
-              </w:trPr>
-              <w:tc>
-                <w:tcPr>
-                  <w:tcW w:w="36" w:type="dxa"/>
-                  <w:vAlign w:val="center"/>
-                  <w:hideMark/>
-                </w:tcPr>
-                <w:p>
-                  <w:pPr>
-                    <w:framePr w:hSpace="141" w:wrap="around" w:vAnchor="text" w:hAnchor="margin" w:y="167"/>
-                    <w:spacing w:after="0" w:line="240" w:lineRule="auto"/>
-                    <w:rPr>
-                      <w:rFonts w:ascii="Arial Nova" w:hAnsi="Arial Nova"/>
-                      <w:lang w:val="es-MX"/>
-                    </w:rPr>
-                  </w:pPr>
-                </w:p>
-              </w:tc>
-            </w:tr>
-          </w:tbl>
-          <w:p>
-            <w:pPr>
-              <w:rPr>
-                <w:rFonts w:ascii="Arial Nova" w:hAnsi="Arial Nova"/>
-                <w:vanish/>
-                <w:lang w:val="es-MX"/>
-              </w:rPr>
-            </w:pPr>
-          </w:p>
-          <w:tbl>
-            <w:tblPr>
-              <w:tblW w:w="0" w:type="auto"/>
-              <w:tblCellSpacing w:w="15" w:type="dxa"/>
-              <w:tblCellMar>
-                <w:top w:w="15" w:type="dxa"/>
-                <w:left w:w="15" w:type="dxa"/>
-                <w:bottom w:w="15" w:type="dxa"/>
-                <w:right w:w="15" w:type="dxa"/>
-              </w:tblCellMar>
-              <w:tblLook w:val="04A0" w:firstRow="1" w:lastRow="0" w:firstColumn="1" w:lastColumn="0" w:noHBand="0" w:noVBand="1"/>
-            </w:tblPr>
-            <w:tblGrid>
-              <w:gridCol w:w="1051"/>
-            </w:tblGrid>
-            <w:tr>
-              <w:trPr>
-                <w:tblCellSpacing w:w="15" w:type="dxa"/>
-              </w:trPr>
-              <w:tc>
-                <w:tcPr>
-                  <w:tcW w:w="991" w:type="dxa"/>
-                  <w:vAlign w:val="center"/>
-                  <w:hideMark/>
-                </w:tcPr>
-                <w:p>
-                  <w:pPr>
-                    <w:framePr w:hSpace="141" w:wrap="around" w:vAnchor="text" w:hAnchor="margin" w:y="167"/>
-                    <w:spacing w:after="0" w:line="240" w:lineRule="auto"/>
-                    <w:rPr>
-                      <w:rFonts w:ascii="Arial Nova" w:hAnsi="Arial Nova"/>
-                      <w:lang w:val="es-MX"/>
-                    </w:rPr>
-                  </w:pPr>
-                  <w:r>
-                    <w:rPr>
-                      <w:rFonts w:ascii="Arial Nova" w:hAnsi="Arial Nova"/>
-                      <w:lang w:val="es-MX"/>
-                    </w:rPr>
-                    <w:t>{</w:t>
-                  </w:r>
-                  <w:proofErr w:type="spellStart"/>
-                  <w:r>
-                    <w:rPr>
-                      <w:rFonts w:ascii="Arial Nova" w:hAnsi="Arial Nova"/>
-                      <w:lang w:val="es-MX"/>
-                    </w:rPr>
-                    <w:t>capaNo</w:t>
-                  </w:r>
-                  <w:proofErr w:type="spellEnd"/>
-                  <w:r>
-                    <w:rPr>
-                      <w:rFonts w:ascii="Arial Nova" w:hAnsi="Arial Nova"/>
-                      <w:lang w:val="es-MX"/>
-                    </w:rPr>
-                    <w:t>}</w:t>
-                  </w:r>
-                </w:p>
-              </w:tc>
-            </w:tr>
-          </w:tbl>
-          <w:p>
-            <w:pPr>
-              <w:rPr>
-                <w:rFonts w:ascii="Arial Nova" w:hAnsi="Arial Nova"/>
-              </w:rPr>
-            </w:pPr>
-            <w:r>
-              <w:rPr>
-                <w:rFonts w:ascii="Arial Nova" w:hAnsi="Arial Nova"/>
-              </w:rPr>
-              <w:t xml:space="preserve"> </w:t>
-            </w:r>
+          <w:p>
+            <w:pPr>
+              <w:rPr>
+                <w:rFonts w:ascii="Arial Nova" w:hAnsi="Arial Nova"/>
+              </w:rPr>
+            </w:pPr>
+            <w:r>
+              <w:rPr>
+                <w:rFonts w:ascii="Arial Nova" w:hAnsi="Arial Nova"/>
+              </w:rPr>
+              <w:fldChar w:fldCharType="begin">
+                <w:ffData>
+                  <w:name w:val="Check2"/>
+                  <w:enabled/>
+                  <w:calcOnExit w:val="0"/>
+                  <w:checkBox>
+                    <w:sizeAuto/>
+                    <w:default w:val="0"/>
+                  </w:checkBox>
+                </w:ffData>
+              </w:fldChar>
+            </w:r>
+            <w:bookmarkStart w:id="1" w:name="Check2"/>
+            <w:r>
+              <w:rPr>
+                <w:rFonts w:ascii="Arial Nova" w:hAnsi="Arial Nova"/>
+              </w:rPr>
+              <w:instrText xml:space="preserve"> FORMCHECKBOX </w:instrText>
+            </w:r>
+            <w:r>
+              <w:rPr>
+                <w:rFonts w:ascii="Arial Nova" w:hAnsi="Arial Nova"/>
+              </w:rPr>
+            </w:r>
+            <w:r>
+              <w:rPr>
+                <w:rFonts w:ascii="Arial Nova" w:hAnsi="Arial Nova"/>
+              </w:rPr>
+              <w:fldChar w:fldCharType="separate"/>
+            </w:r>
+            <w:r>
+              <w:rPr>
+                <w:rFonts w:ascii="Arial Nova" w:hAnsi="Arial Nova"/>
+              </w:rPr>
+              <w:fldChar w:fldCharType="end"/>
+            </w:r>
+            <w:bookmarkEnd w:id="1"/>
             <w:r>
               <w:rPr>
                 <w:rFonts w:ascii="Arial Nova" w:hAnsi="Arial Nova"/>
@@ -2738,33 +2641,46 @@
               <w:rPr>
                 <w:rFonts w:ascii="Arial Nova" w:hAnsi="Arial Nova"/>
               </w:rPr>
-              <w:t>{</w:t>
-            </w:r>
-            <w:proofErr w:type="spellStart"/>
-            <w:r>
-              <w:rPr>
-                <w:rFonts w:ascii="Arial Nova" w:hAnsi="Arial Nova"/>
-              </w:rPr>
-              <w:t>dispositionRework</w:t>
-            </w:r>
-            <w:proofErr w:type="spellEnd"/>
-            <w:r>
-              <w:rPr>
-                <w:rFonts w:ascii="Arial Nova" w:hAnsi="Arial Nova"/>
-              </w:rPr>
-              <w:t>}</w:t>
-            </w:r>
-            <w:r>
-              <w:rPr>
-                <w:rFonts w:ascii="Arial Nova" w:hAnsi="Arial Nova"/>
-              </w:rPr>
-              <w:t xml:space="preserve"> </w:t>
-            </w:r>
-            <w:r>
-              <w:rPr>
-                <w:rFonts w:ascii="Arial Nova" w:hAnsi="Arial Nova"/>
-              </w:rPr>
-              <w:t>Re-</w:t>
+              <w:fldChar w:fldCharType="begin">
+                <w:ffData>
+                  <w:name w:val="Check1"/>
+                  <w:enabled/>
+                  <w:calcOnExit w:val="0"/>
+                  <w:checkBox>
+                    <w:sizeAuto/>
+                    <w:default w:val="0"/>
+                  </w:checkBox>
+                </w:ffData>
+              </w:fldChar>
+            </w:r>
+            <w:r>
+              <w:rPr>
+                <w:rFonts w:ascii="Arial Nova" w:hAnsi="Arial Nova"/>
+              </w:rPr>
+              <w:instrText xml:space="preserve"> FORMCHECKBOX </w:instrText>
+            </w:r>
+            <w:r>
+              <w:rPr>
+                <w:rFonts w:ascii="Arial Nova" w:hAnsi="Arial Nova"/>
+              </w:rPr>
+            </w:r>
+            <w:r>
+              <w:rPr>
+                <w:rFonts w:ascii="Arial Nova" w:hAnsi="Arial Nova"/>
+              </w:rPr>
+              <w:fldChar w:fldCharType="separate"/>
+            </w:r>
+            <w:r>
+              <w:rPr>
+                <w:rFonts w:ascii="Arial Nova" w:hAnsi="Arial Nova"/>
+              </w:rPr>
+              <w:fldChar w:fldCharType="end"/>
+            </w:r>
+            <w:r>
+              <w:rPr>
+                <w:rFonts w:ascii="Arial Nova" w:hAnsi="Arial Nova"/>
+              </w:rPr>
+              <w:t xml:space="preserve"> Re-</w:t>
             </w:r>
             <w:proofErr w:type="spellStart"/>
             <w:r>
@@ -2792,21 +2708,40 @@
               <w:rPr>
                 <w:rFonts w:ascii="Arial Nova" w:hAnsi="Arial Nova"/>
               </w:rPr>
-              <w:t>{</w:t>
-            </w:r>
-            <w:proofErr w:type="spellStart"/>
-            <w:r>
-              <w:rPr>
-                <w:rFonts w:ascii="Arial Nova" w:hAnsi="Arial Nova"/>
-              </w:rPr>
-              <w:t>dispositionReturn</w:t>
-            </w:r>
-            <w:proofErr w:type="spellEnd"/>
-            <w:r>
-              <w:rPr>
-                <w:rFonts w:ascii="Arial Nova" w:hAnsi="Arial Nova"/>
-              </w:rPr>
-              <w:t>}</w:t>
+              <w:fldChar w:fldCharType="begin">
+                <w:ffData>
+                  <w:name w:val="Check1"/>
+                  <w:enabled/>
+                  <w:calcOnExit w:val="0"/>
+                  <w:checkBox>
+                    <w:sizeAuto/>
+                    <w:default w:val="0"/>
+                  </w:checkBox>
+                </w:ffData>
+              </w:fldChar>
+            </w:r>
+            <w:r>
+              <w:rPr>
+                <w:rFonts w:ascii="Arial Nova" w:hAnsi="Arial Nova"/>
+              </w:rPr>
+              <w:instrText xml:space="preserve"> FORMCHECKBOX </w:instrText>
+            </w:r>
+            <w:r>
+              <w:rPr>
+                <w:rFonts w:ascii="Arial Nova" w:hAnsi="Arial Nova"/>
+              </w:rPr>
+            </w:r>
+            <w:r>
+              <w:rPr>
+                <w:rFonts w:ascii="Arial Nova" w:hAnsi="Arial Nova"/>
+              </w:rPr>
+              <w:fldChar w:fldCharType="separate"/>
+            </w:r>
+            <w:r>
+              <w:rPr>
+                <w:rFonts w:ascii="Arial Nova" w:hAnsi="Arial Nova"/>
+              </w:rPr>
+              <w:fldChar w:fldCharType="end"/>
             </w:r>
             <w:r>
               <w:rPr>
@@ -2855,21 +2790,46 @@
               <w:rPr>
                 <w:rFonts w:ascii="Arial Nova" w:hAnsi="Arial Nova"/>
               </w:rPr>
-              <w:t>{</w:t>
-            </w:r>
-            <w:proofErr w:type="spellStart"/>
-            <w:r>
-              <w:rPr>
-                <w:rFonts w:ascii="Arial Nova" w:hAnsi="Arial Nova"/>
-              </w:rPr>
-              <w:t>dispositionUseAsIs</w:t>
-            </w:r>
-            <w:proofErr w:type="spellEnd"/>
-            <w:r>
-              <w:rPr>
-                <w:rFonts w:ascii="Arial Nova" w:hAnsi="Arial Nova"/>
-              </w:rPr>
-              <w:t>}</w:t>
+              <w:fldChar w:fldCharType="begin">
+                <w:ffData>
+                  <w:name w:val="Check1"/>
+                  <w:enabled/>
+                  <w:calcOnExit w:val="0"/>
+                  <w:checkBox>
+                    <w:sizeAuto/>
+                    <w:default w:val="0"/>
+                  </w:checkBox>
+                </w:ffData>
+              </w:fldChar>
+            </w:r>
+            <w:r>
+              <w:rPr>
+                <w:rFonts w:ascii="Arial Nova" w:hAnsi="Arial Nova"/>
+              </w:rPr>
+              <w:instrText xml:space="preserve"> FORMCHECKBOX </w:instrText>
+            </w:r>
+            <w:r>
+              <w:rPr>
+                <w:rFonts w:ascii="Arial Nova" w:hAnsi="Arial Nova"/>
+              </w:rPr>
+            </w:r>
+            <w:r>
+              <w:rPr>
+                <w:rFonts w:ascii="Arial Nova" w:hAnsi="Arial Nova"/>
+              </w:rPr>
+              <w:fldChar w:fldCharType="separate"/>
+            </w:r>
+            <w:r>
+              <w:rPr>
+                <w:rFonts w:ascii="Arial Nova" w:hAnsi="Arial Nova"/>
+              </w:rPr>
+              <w:fldChar w:fldCharType="end"/>
+            </w:r>
+            <w:r>
+              <w:rPr>
+                <w:rFonts w:ascii="Arial Nova" w:hAnsi="Arial Nova"/>
+              </w:rPr>
+              <w:t xml:space="preserve"> </w:t>
             </w:r>
             <w:r>
               <w:rPr>
@@ -2919,7 +2879,7 @@
       </w:tr>
       <w:tr>
         <w:trPr>
-          <w:trHeight w:val="403"/>
+          <w:trHeight w:val="977"/>
         </w:trPr>
         <w:tc>
           <w:tcPr>
@@ -2955,39 +2915,61 @@
             <w:r>
               <w:rPr>
                 <w:rFonts w:ascii="Arial Nova" w:hAnsi="Arial Nova"/>
-                <w:lang w:val="es-MX"/>
-              </w:rPr>
-              <w:t>{</w:t>
-            </w:r>
-            <w:proofErr w:type="spellStart"/>
-            <w:r>
-              <w:rPr>
-                <w:rFonts w:ascii="Arial Nova" w:hAnsi="Arial Nova"/>
-                <w:lang w:val="es-MX"/>
-              </w:rPr>
-              <w:t>dispositionRandD</w:t>
-            </w:r>
-            <w:proofErr w:type="spellEnd"/>
-            <w:r>
-              <w:rPr>
-                <w:rFonts w:ascii="Arial Nova" w:hAnsi="Arial Nova"/>
-                <w:lang w:val="es-MX"/>
-              </w:rPr>
-              <w:t>}</w:t>
-            </w:r>
-            <w:r>
-              <w:rPr>
-                <w:rFonts w:ascii="Arial Nova" w:hAnsi="Arial Nova"/>
-                <w:lang w:val="es-MX"/>
-              </w:rPr>
-              <w:t xml:space="preserve"> </w:t>
-            </w:r>
-            <w:r>
-              <w:rPr>
-                <w:rFonts w:ascii="Arial Nova" w:hAnsi="Arial Nova"/>
-                <w:lang w:val="es-MX"/>
-              </w:rPr>
-              <w:t xml:space="preserve">Uso para R&amp;D  </w:t>
+              </w:rPr>
+              <w:fldChar w:fldCharType="begin">
+                <w:ffData>
+                  <w:name w:val="Check1"/>
+                  <w:enabled/>
+                  <w:calcOnExit w:val="0"/>
+                  <w:checkBox>
+                    <w:sizeAuto/>
+                    <w:default w:val="0"/>
+                  </w:checkBox>
+                </w:ffData>
+              </w:fldChar>
+            </w:r>
+            <w:r>
+              <w:rPr>
+                <w:rFonts w:ascii="Arial Nova" w:hAnsi="Arial Nova"/>
+              </w:rPr>
+              <w:instrText xml:space="preserve"> FORMCHECKBOX </w:instrText>
+            </w:r>
+            <w:r>
+              <w:rPr>
+                <w:rFonts w:ascii="Arial Nova" w:hAnsi="Arial Nova"/>
+              </w:rPr>
+            </w:r>
+            <w:r>
+              <w:rPr>
+                <w:rFonts w:ascii="Arial Nova" w:hAnsi="Arial Nova"/>
+              </w:rPr>
+              <w:fldChar w:fldCharType="separate"/>
+            </w:r>
+            <w:r>
+              <w:rPr>
+                <w:rFonts w:ascii="Arial Nova" w:hAnsi="Arial Nova"/>
+              </w:rPr>
+              <w:fldChar w:fldCharType="end"/>
+            </w:r>
+            <w:r>
+              <w:rPr>
+                <w:rFonts w:ascii="Arial Nova" w:hAnsi="Arial Nova"/>
+              </w:rPr>
+              <w:t xml:space="preserve"> Uso </w:t>
+            </w:r>
+            <w:proofErr w:type="gramStart"/>
+            <w:r>
+              <w:rPr>
+                <w:rFonts w:ascii="Arial Nova" w:hAnsi="Arial Nova"/>
+              </w:rPr>
+              <w:t>para R</w:t>
+            </w:r>
+            <w:proofErr w:type="gramEnd"/>
+            <w:r>
+              <w:rPr>
+                <w:rFonts w:ascii="Arial Nova" w:hAnsi="Arial Nova"/>
+              </w:rPr>
+              <w:t xml:space="preserve">&amp;D  </w:t>
             </w:r>
           </w:p>
         </w:tc>
@@ -3008,21 +2990,46 @@
               <w:rPr>
                 <w:rFonts w:ascii="Arial Nova" w:hAnsi="Arial Nova"/>
               </w:rPr>
-              <w:t>{</w:t>
-            </w:r>
-            <w:proofErr w:type="spellStart"/>
-            <w:r>
-              <w:rPr>
-                <w:rFonts w:ascii="Arial Nova" w:hAnsi="Arial Nova"/>
-              </w:rPr>
-              <w:t>dispositionScrap</w:t>
-            </w:r>
-            <w:proofErr w:type="spellEnd"/>
-            <w:r>
-              <w:rPr>
-                <w:rFonts w:ascii="Arial Nova" w:hAnsi="Arial Nova"/>
-              </w:rPr>
-              <w:t>}</w:t>
+              <w:fldChar w:fldCharType="begin">
+                <w:ffData>
+                  <w:name w:val="Check1"/>
+                  <w:enabled/>
+                  <w:calcOnExit w:val="0"/>
+                  <w:checkBox>
+                    <w:sizeAuto/>
+                    <w:default w:val="0"/>
+                  </w:checkBox>
+                </w:ffData>
+              </w:fldChar>
+            </w:r>
+            <w:r>
+              <w:rPr>
+                <w:rFonts w:ascii="Arial Nova" w:hAnsi="Arial Nova"/>
+              </w:rPr>
+              <w:instrText xml:space="preserve"> FORMCHECKBOX </w:instrText>
+            </w:r>
+            <w:r>
+              <w:rPr>
+                <w:rFonts w:ascii="Arial Nova" w:hAnsi="Arial Nova"/>
+              </w:rPr>
+            </w:r>
+            <w:r>
+              <w:rPr>
+                <w:rFonts w:ascii="Arial Nova" w:hAnsi="Arial Nova"/>
+              </w:rPr>
+              <w:fldChar w:fldCharType="separate"/>
+            </w:r>
+            <w:r>
+              <w:rPr>
+                <w:rFonts w:ascii="Arial Nova" w:hAnsi="Arial Nova"/>
+              </w:rPr>
+              <w:fldChar w:fldCharType="end"/>
+            </w:r>
+            <w:r>
+              <w:rPr>
+                <w:rFonts w:ascii="Arial Nova" w:hAnsi="Arial Nova"/>
+              </w:rPr>
+              <w:t xml:space="preserve"> </w:t>
             </w:r>
             <w:r>
               <w:rPr>
@@ -3048,45 +3055,63 @@
               <w:rPr>
                 <w:rFonts w:ascii="Arial Nova" w:hAnsi="Arial Nova"/>
               </w:rPr>
-              <w:t>{</w:t>
+              <w:fldChar w:fldCharType="begin">
+                <w:ffData>
+                  <w:name w:val="Check1"/>
+                  <w:enabled/>
+                  <w:calcOnExit w:val="0"/>
+                  <w:checkBox>
+                    <w:sizeAuto/>
+                    <w:default w:val="0"/>
+                  </w:checkBox>
+                </w:ffData>
+              </w:fldChar>
+            </w:r>
+            <w:r>
+              <w:rPr>
+                <w:rFonts w:ascii="Arial Nova" w:hAnsi="Arial Nova"/>
+              </w:rPr>
+              <w:instrText xml:space="preserve"> FORMCHECKBOX </w:instrText>
+            </w:r>
+            <w:r>
+              <w:rPr>
+                <w:rFonts w:ascii="Arial Nova" w:hAnsi="Arial Nova"/>
+              </w:rPr>
+            </w:r>
+            <w:r>
+              <w:rPr>
+                <w:rFonts w:ascii="Arial Nova" w:hAnsi="Arial Nova"/>
+              </w:rPr>
+              <w:fldChar w:fldCharType="separate"/>
+            </w:r>
+            <w:r>
+              <w:rPr>
+                <w:rFonts w:ascii="Arial Nova" w:hAnsi="Arial Nova"/>
+              </w:rPr>
+              <w:fldChar w:fldCharType="end"/>
+            </w:r>
+            <w:r>
+              <w:rPr>
+                <w:rFonts w:ascii="Arial Nova" w:hAnsi="Arial Nova"/>
+              </w:rPr>
+              <w:t xml:space="preserve"> </w:t>
             </w:r>
             <w:proofErr w:type="spellStart"/>
             <w:r>
               <w:rPr>
                 <w:rFonts w:ascii="Arial Nova" w:hAnsi="Arial Nova"/>
               </w:rPr>
-              <w:t>dispositionOther</w:t>
+              <w:t>Otro:</w:t>
             </w:r>
             <w:proofErr w:type="spellEnd"/>
-            <w:r>
-              <w:rPr>
-                <w:rFonts w:ascii="Arial Nova" w:hAnsi="Arial Nova"/>
-              </w:rPr>
-              <w:t xml:space="preserve">} </w:t>
-            </w:r>
+          </w:p>
+          <w:p>
+            <w:pPr>
+              <w:rPr>
+                <w:rFonts w:ascii="Arial Nova" w:hAnsi="Arial Nova"/>
+              </w:rPr>
+            </w:pPr>
             <w:proofErr w:type="spellStart"/>
-            <w:proofErr w:type="gramStart"/>
-            <w:r>
-              <w:rPr>
-                <w:rFonts w:ascii="Arial Nova" w:hAnsi="Arial Nova"/>
-              </w:rPr>
-              <w:t>Otro</w:t>
-            </w:r>
-            <w:proofErr w:type="spellEnd"/>
-            <w:r>
-              <w:rPr>
-                <w:rFonts w:ascii="Arial Nova" w:hAnsi="Arial Nova"/>
-              </w:rPr>
-              <w:t>:</w:t>
-            </w:r>
-            <w:r>
-              <w:rPr>
-                <w:rFonts w:ascii="Arial Nova" w:hAnsi="Arial Nova"/>
-              </w:rPr>
-              <w:t>{</w:t>
-            </w:r>
-            <w:proofErr w:type="spellStart"/>
-            <w:proofErr w:type="gramEnd"/>
             <w:r>
               <w:rPr>
                 <w:rFonts w:ascii="Arial Nova" w:hAnsi="Arial Nova"/>
@@ -6597,6 +6622,7 @@
   <w:style w:type="character" w:default="1" w:styleId="Fuentedeprrafopredeter">
     <w:name w:val="Default Paragraph Font"/>
     <w:uiPriority w:val="1"/>
+    <w:semiHidden/>
     <w:unhideWhenUsed/>
   </w:style>
   <w:style w:type="table" w:default="1" w:styleId="Tablanormal">

</xml_diff>

<commit_message>
reporte no conformidad solo primera parte
</commit_message>
<xml_diff>
--- a/public/templates/Reporte No conformidad Inspec Entrada.docx
+++ b/public/templates/Reporte No conformidad Inspec Entrada.docx
@@ -11,8 +11,8 @@
         <w:tblLook w:val="04A0" w:firstRow="1" w:lastRow="0" w:firstColumn="1" w:lastColumn="0" w:noHBand="0" w:noVBand="1"/>
       </w:tblPr>
       <w:tblGrid>
-        <w:gridCol w:w="988"/>
-        <w:gridCol w:w="992"/>
+        <w:gridCol w:w="1165"/>
+        <w:gridCol w:w="815"/>
         <w:gridCol w:w="1417"/>
         <w:gridCol w:w="57"/>
         <w:gridCol w:w="390"/>
@@ -21,13 +21,13 @@
         <w:gridCol w:w="200"/>
         <w:gridCol w:w="292"/>
         <w:gridCol w:w="145"/>
-        <w:gridCol w:w="734"/>
-        <w:gridCol w:w="377"/>
+        <w:gridCol w:w="1042"/>
+        <w:gridCol w:w="69"/>
         <w:gridCol w:w="218"/>
         <w:gridCol w:w="491"/>
         <w:gridCol w:w="328"/>
-        <w:gridCol w:w="357"/>
-        <w:gridCol w:w="224"/>
+        <w:gridCol w:w="514"/>
+        <w:gridCol w:w="67"/>
         <w:gridCol w:w="74"/>
         <w:gridCol w:w="185"/>
         <w:gridCol w:w="133"/>
@@ -589,6 +589,14 @@
                 <w:rFonts w:ascii="Arial Nova" w:hAnsi="Arial Nova"/>
               </w:rPr>
             </w:pPr>
+          </w:p>
+          <w:p>
+            <w:pPr>
+              <w:jc w:val="center"/>
+              <w:rPr>
+                <w:rFonts w:ascii="Arial Nova" w:hAnsi="Arial Nova"/>
+              </w:rPr>
+            </w:pPr>
             <w:r>
               <w:rPr>
                 <w:rFonts w:ascii="Arial Nova" w:hAnsi="Arial Nova"/>
@@ -652,6 +660,9 @@
         </w:tc>
       </w:tr>
       <w:tr>
+        <w:trPr>
+          <w:trHeight w:val="869"/>
+        </w:trPr>
         <w:tc>
           <w:tcPr>
             <w:tcW w:w="1980" w:type="dxa"/>
@@ -659,6 +670,7 @@
           </w:tcPr>
           <w:p>
             <w:pPr>
+              <w:jc w:val="center"/>
               <w:rPr>
                 <w:rFonts w:ascii="Arial Nova" w:hAnsi="Arial Nova"/>
                 <w:b/>
@@ -666,14 +678,24 @@
                 <w:lang w:val="es-MX"/>
               </w:rPr>
             </w:pPr>
-            <w:r>
+          </w:p>
+          <w:p>
+            <w:pPr>
               <w:rPr>
                 <w:rFonts w:ascii="Arial Nova" w:hAnsi="Arial Nova"/>
                 <w:b/>
                 <w:bCs/>
                 <w:lang w:val="es-MX"/>
               </w:rPr>
-              <w:t xml:space="preserve">Fuente de la NC </w:t>
+            </w:pPr>
+            <w:r>
+              <w:rPr>
+                <w:rFonts w:ascii="Arial Nova" w:hAnsi="Arial Nova"/>
+                <w:b/>
+                <w:bCs/>
+                <w:lang w:val="es-MX"/>
+              </w:rPr>
+              <w:t>Fuente de la NC</w:t>
             </w:r>
           </w:p>
         </w:tc>
@@ -825,6 +847,13 @@
                 <w:rFonts w:ascii="Arial Nova" w:hAnsi="Arial Nova"/>
               </w:rPr>
             </w:pPr>
+          </w:p>
+          <w:p>
+            <w:pPr>
+              <w:rPr>
+                <w:rFonts w:ascii="Arial Nova" w:hAnsi="Arial Nova"/>
+              </w:rPr>
+            </w:pPr>
             <w:r>
               <w:rPr>
                 <w:rFonts w:ascii="Arial Nova" w:hAnsi="Arial Nova"/>
@@ -954,7 +983,7 @@
         </w:trPr>
         <w:tc>
           <w:tcPr>
-            <w:tcW w:w="988" w:type="dxa"/>
+            <w:tcW w:w="1165" w:type="dxa"/>
             <w:vAlign w:val="center"/>
           </w:tcPr>
           <w:p>
@@ -988,7 +1017,7 @@
         </w:tc>
         <w:tc>
           <w:tcPr>
-            <w:tcW w:w="2409" w:type="dxa"/>
+            <w:tcW w:w="2232" w:type="dxa"/>
             <w:gridSpan w:val="2"/>
             <w:vAlign w:val="center"/>
           </w:tcPr>
@@ -1033,7 +1062,7 @@
         </w:tc>
         <w:tc>
           <w:tcPr>
-            <w:tcW w:w="2410" w:type="dxa"/>
+            <w:tcW w:w="2718" w:type="dxa"/>
             <w:gridSpan w:val="8"/>
             <w:vAlign w:val="center"/>
           </w:tcPr>
@@ -1068,7 +1097,7 @@
         </w:tc>
         <w:tc>
           <w:tcPr>
-            <w:tcW w:w="1771" w:type="dxa"/>
+            <w:tcW w:w="1620" w:type="dxa"/>
             <w:gridSpan w:val="5"/>
             <w:vAlign w:val="center"/>
           </w:tcPr>
@@ -1093,7 +1122,7 @@
         </w:tc>
         <w:tc>
           <w:tcPr>
-            <w:tcW w:w="1772" w:type="dxa"/>
+            <w:tcW w:w="1615" w:type="dxa"/>
             <w:gridSpan w:val="5"/>
             <w:vAlign w:val="center"/>
           </w:tcPr>
@@ -1141,7 +1170,7 @@
         </w:trPr>
         <w:tc>
           <w:tcPr>
-            <w:tcW w:w="988" w:type="dxa"/>
+            <w:tcW w:w="1165" w:type="dxa"/>
             <w:vAlign w:val="center"/>
           </w:tcPr>
           <w:p>
@@ -1194,7 +1223,7 @@
         </w:tc>
         <w:tc>
           <w:tcPr>
-            <w:tcW w:w="2409" w:type="dxa"/>
+            <w:tcW w:w="2232" w:type="dxa"/>
             <w:gridSpan w:val="2"/>
             <w:vAlign w:val="center"/>
           </w:tcPr>
@@ -1229,7 +1258,7 @@
         </w:tc>
         <w:tc>
           <w:tcPr>
-            <w:tcW w:w="2410" w:type="dxa"/>
+            <w:tcW w:w="2718" w:type="dxa"/>
             <w:gridSpan w:val="8"/>
             <w:vAlign w:val="center"/>
           </w:tcPr>
@@ -1263,7 +1292,7 @@
         </w:tc>
         <w:tc>
           <w:tcPr>
-            <w:tcW w:w="1771" w:type="dxa"/>
+            <w:tcW w:w="1620" w:type="dxa"/>
             <w:gridSpan w:val="5"/>
             <w:vAlign w:val="center"/>
           </w:tcPr>
@@ -1317,7 +1346,7 @@
         </w:tc>
         <w:tc>
           <w:tcPr>
-            <w:tcW w:w="1772" w:type="dxa"/>
+            <w:tcW w:w="1615" w:type="dxa"/>
             <w:gridSpan w:val="5"/>
             <w:vAlign w:val="center"/>
           </w:tcPr>
@@ -1493,7 +1522,7 @@
       </w:tr>
       <w:tr>
         <w:trPr>
-          <w:trHeight w:val="2110"/>
+          <w:trHeight w:val="1594"/>
         </w:trPr>
         <w:tc>
           <w:tcPr>
@@ -1646,7 +1675,7 @@
         </w:tc>
         <w:tc>
           <w:tcPr>
-            <w:tcW w:w="3827" w:type="dxa"/>
+            <w:tcW w:w="4135" w:type="dxa"/>
             <w:gridSpan w:val="9"/>
             <w:vAlign w:val="center"/>
           </w:tcPr>
@@ -1714,7 +1743,7 @@
         </w:tc>
         <w:tc>
           <w:tcPr>
-            <w:tcW w:w="3543" w:type="dxa"/>
+            <w:tcW w:w="3235" w:type="dxa"/>
             <w:gridSpan w:val="10"/>
             <w:vAlign w:val="center"/>
           </w:tcPr>
@@ -2155,26 +2184,6 @@
                 <w:rFonts w:ascii="Arial Nova" w:hAnsi="Arial Nova"/>
               </w:rPr>
             </w:pPr>
-            <w:r>
-              <w:rPr>
-                <w:rFonts w:ascii="Arial Nova" w:hAnsi="Arial Nova"/>
-              </w:rPr>
-              <w:t>{</w:t>
-            </w:r>
-            <w:proofErr w:type="spellStart"/>
-            <w:r>
-              <w:rPr>
-                <w:rFonts w:ascii="Arial Nova" w:hAnsi="Arial Nova"/>
-              </w:rPr>
-              <w:t>riskSeverity</w:t>
-            </w:r>
-            <w:proofErr w:type="spellEnd"/>
-            <w:r>
-              <w:rPr>
-                <w:rFonts w:ascii="Arial Nova" w:hAnsi="Arial Nova"/>
-              </w:rPr>
-              <w:t>}</w:t>
-            </w:r>
           </w:p>
         </w:tc>
         <w:tc>
@@ -2526,26 +2535,6 @@
                 <w:rFonts w:ascii="Arial Nova" w:hAnsi="Arial Nova"/>
               </w:rPr>
             </w:pPr>
-            <w:r>
-              <w:rPr>
-                <w:rFonts w:ascii="Arial Nova" w:hAnsi="Arial Nova"/>
-              </w:rPr>
-              <w:t>{</w:t>
-            </w:r>
-            <w:proofErr w:type="spellStart"/>
-            <w:r>
-              <w:rPr>
-                <w:rFonts w:ascii="Arial Nova" w:hAnsi="Arial Nova"/>
-              </w:rPr>
-              <w:t>riskOccurrence</w:t>
-            </w:r>
-            <w:proofErr w:type="spellEnd"/>
-            <w:r>
-              <w:rPr>
-                <w:rFonts w:ascii="Arial Nova" w:hAnsi="Arial Nova"/>
-              </w:rPr>
-              <w:t>}</w:t>
-            </w:r>
           </w:p>
         </w:tc>
         <w:tc>
@@ -3101,36 +3090,28 @@
               <w:rPr>
                 <w:rFonts w:ascii="Arial Nova" w:hAnsi="Arial Nova"/>
               </w:rPr>
-              <w:t>Otro:</w:t>
+              <w:t>Otro</w:t>
             </w:r>
             <w:proofErr w:type="spellEnd"/>
-          </w:p>
-          <w:p>
-            <w:pPr>
-              <w:rPr>
-                <w:rFonts w:ascii="Arial Nova" w:hAnsi="Arial Nova"/>
-              </w:rPr>
-            </w:pPr>
-            <w:proofErr w:type="spellStart"/>
-            <w:r>
-              <w:rPr>
-                <w:rFonts w:ascii="Arial Nova" w:hAnsi="Arial Nova"/>
-              </w:rPr>
-              <w:t>dispositionOtherText</w:t>
-            </w:r>
-            <w:proofErr w:type="spellEnd"/>
-            <w:r>
-              <w:rPr>
-                <w:rFonts w:ascii="Arial Nova" w:hAnsi="Arial Nova"/>
-              </w:rPr>
-              <w:t>}</w:t>
-            </w:r>
+            <w:r>
+              <w:rPr>
+                <w:rFonts w:ascii="Arial Nova" w:hAnsi="Arial Nova"/>
+              </w:rPr>
+              <w:t>:</w:t>
+            </w:r>
+          </w:p>
+          <w:p>
+            <w:pPr>
+              <w:rPr>
+                <w:rFonts w:ascii="Arial Nova" w:hAnsi="Arial Nova"/>
+              </w:rPr>
+            </w:pPr>
           </w:p>
         </w:tc>
       </w:tr>
       <w:tr>
         <w:trPr>
-          <w:trHeight w:val="403"/>
+          <w:trHeight w:val="1793"/>
         </w:trPr>
         <w:tc>
           <w:tcPr>
@@ -3259,29 +3240,6 @@
                       <w:lang w:val="es-MX"/>
                     </w:rPr>
                   </w:pPr>
-                  <w:r>
-                    <w:rPr>
-                      <w:rFonts w:ascii="Arial Nova" w:hAnsi="Arial Nova"/>
-                      <w:lang w:val="es-MX"/>
-                    </w:rPr>
-                    <w:t>{</w:t>
-                  </w:r>
-                  <w:proofErr w:type="spellStart"/>
-                  <w:r>
-                    <w:rPr>
-                      <w:rFonts w:ascii="Arial Nova" w:hAnsi="Arial Nova"/>
-                      <w:lang w:val="es-MX"/>
-                    </w:rPr>
-                    <w:t>dispositionJustification</w:t>
-                  </w:r>
-                  <w:proofErr w:type="spellEnd"/>
-                  <w:r>
-                    <w:rPr>
-                      <w:rFonts w:ascii="Arial Nova" w:hAnsi="Arial Nova"/>
-                      <w:lang w:val="es-MX"/>
-                    </w:rPr>
-                    <w:t>}</w:t>
-                  </w:r>
                 </w:p>
               </w:tc>
             </w:tr>
@@ -3676,29 +3634,6 @@
                       <w:lang w:val="es-MX"/>
                     </w:rPr>
                   </w:pPr>
-                  <w:r>
-                    <w:rPr>
-                      <w:rFonts w:ascii="Arial Nova" w:hAnsi="Arial Nova"/>
-                      <w:lang w:val="es-MX"/>
-                    </w:rPr>
-                    <w:t>{</w:t>
-                  </w:r>
-                  <w:proofErr w:type="spellStart"/>
-                  <w:r>
-                    <w:rPr>
-                      <w:rFonts w:ascii="Arial Nova" w:hAnsi="Arial Nova"/>
-                      <w:lang w:val="es-MX"/>
-                    </w:rPr>
-                    <w:t>iifReference</w:t>
-                  </w:r>
-                  <w:proofErr w:type="spellEnd"/>
-                  <w:r>
-                    <w:rPr>
-                      <w:rFonts w:ascii="Arial Nova" w:hAnsi="Arial Nova"/>
-                      <w:lang w:val="es-MX"/>
-                    </w:rPr>
-                    <w:t>}</w:t>
-                  </w:r>
                 </w:p>
               </w:tc>
             </w:tr>
@@ -3752,26 +3687,6 @@
                 <w:lang w:val="es-ES"/>
               </w:rPr>
             </w:pPr>
-            <w:r>
-              <w:rPr>
-                <w:rFonts w:ascii="Arial Nova" w:hAnsi="Arial Nova"/>
-              </w:rPr>
-              <w:t>{</w:t>
-            </w:r>
-            <w:proofErr w:type="spellStart"/>
-            <w:r>
-              <w:rPr>
-                <w:rFonts w:ascii="Arial Nova" w:hAnsi="Arial Nova"/>
-              </w:rPr>
-              <w:t>qciReference</w:t>
-            </w:r>
-            <w:proofErr w:type="spellEnd"/>
-            <w:r>
-              <w:rPr>
-                <w:rFonts w:ascii="Arial Nova" w:hAnsi="Arial Nova"/>
-              </w:rPr>
-              <w:t>}</w:t>
-            </w:r>
           </w:p>
         </w:tc>
       </w:tr>
@@ -3823,26 +3738,6 @@
                 <w:lang w:val="es-ES"/>
               </w:rPr>
             </w:pPr>
-            <w:r>
-              <w:rPr>
-                <w:rFonts w:ascii="Arial Nova" w:hAnsi="Arial Nova"/>
-              </w:rPr>
-              <w:t>{</w:t>
-            </w:r>
-            <w:proofErr w:type="spellStart"/>
-            <w:r>
-              <w:rPr>
-                <w:rFonts w:ascii="Arial Nova" w:hAnsi="Arial Nova"/>
-              </w:rPr>
-              <w:t>capaReference</w:t>
-            </w:r>
-            <w:proofErr w:type="spellEnd"/>
-            <w:r>
-              <w:rPr>
-                <w:rFonts w:ascii="Arial Nova" w:hAnsi="Arial Nova"/>
-              </w:rPr>
-              <w:t>}</w:t>
-            </w:r>
           </w:p>
         </w:tc>
       </w:tr>
@@ -3894,26 +3789,6 @@
                 <w:lang w:val="es-ES"/>
               </w:rPr>
             </w:pPr>
-            <w:r>
-              <w:rPr>
-                <w:rFonts w:ascii="Arial Nova" w:hAnsi="Arial Nova"/>
-              </w:rPr>
-              <w:t>{</w:t>
-            </w:r>
-            <w:proofErr w:type="spellStart"/>
-            <w:r>
-              <w:rPr>
-                <w:rFonts w:ascii="Arial Nova" w:hAnsi="Arial Nova"/>
-              </w:rPr>
-              <w:t>scarReference</w:t>
-            </w:r>
-            <w:proofErr w:type="spellEnd"/>
-            <w:r>
-              <w:rPr>
-                <w:rFonts w:ascii="Arial Nova" w:hAnsi="Arial Nova"/>
-              </w:rPr>
-              <w:t>}</w:t>
-            </w:r>
           </w:p>
         </w:tc>
       </w:tr>
@@ -4038,29 +3913,6 @@
                       <w:lang w:val="es-MX"/>
                     </w:rPr>
                   </w:pPr>
-                  <w:r>
-                    <w:rPr>
-                      <w:rFonts w:ascii="Arial Nova" w:hAnsi="Arial Nova"/>
-                      <w:lang w:val="es-MX"/>
-                    </w:rPr>
-                    <w:t>{</w:t>
-                  </w:r>
-                  <w:proofErr w:type="spellStart"/>
-                  <w:r>
-                    <w:rPr>
-                      <w:rFonts w:ascii="Arial Nova" w:hAnsi="Arial Nova"/>
-                      <w:lang w:val="es-MX"/>
-                    </w:rPr>
-                    <w:t>recallReference</w:t>
-                  </w:r>
-                  <w:proofErr w:type="spellEnd"/>
-                  <w:r>
-                    <w:rPr>
-                      <w:rFonts w:ascii="Arial Nova" w:hAnsi="Arial Nova"/>
-                      <w:lang w:val="es-MX"/>
-                    </w:rPr>
-                    <w:t>}</w:t>
-                  </w:r>
                 </w:p>
               </w:tc>
             </w:tr>
@@ -4123,26 +3975,6 @@
                 <w:rFonts w:ascii="Arial Nova" w:hAnsi="Arial Nova"/>
               </w:rPr>
             </w:pPr>
-            <w:r>
-              <w:rPr>
-                <w:rFonts w:ascii="Arial Nova" w:hAnsi="Arial Nova"/>
-              </w:rPr>
-              <w:t>{</w:t>
-            </w:r>
-            <w:proofErr w:type="spellStart"/>
-            <w:r>
-              <w:rPr>
-                <w:rFonts w:ascii="Arial Nova" w:hAnsi="Arial Nova"/>
-              </w:rPr>
-              <w:t>otherReferences</w:t>
-            </w:r>
-            <w:proofErr w:type="spellEnd"/>
-            <w:r>
-              <w:rPr>
-                <w:rFonts w:ascii="Arial Nova" w:hAnsi="Arial Nova"/>
-              </w:rPr>
-              <w:t>}</w:t>
-            </w:r>
           </w:p>
         </w:tc>
       </w:tr>
@@ -4266,33 +4098,6 @@
                 <w:rFonts w:ascii="Arial Nova" w:hAnsi="Arial Nova"/>
               </w:rPr>
             </w:pPr>
-            <w:r>
-              <w:rPr>
-                <w:rFonts w:ascii="Arial Nova" w:hAnsi="Arial Nova"/>
-              </w:rPr>
-              <w:t>{</w:t>
-            </w:r>
-            <w:proofErr w:type="spellStart"/>
-            <w:r>
-              <w:rPr>
-                <w:rFonts w:ascii="Arial Nova" w:hAnsi="Arial Nova"/>
-              </w:rPr>
-              <w:t>correctiveActions</w:t>
-            </w:r>
-            <w:proofErr w:type="spellEnd"/>
-            <w:r>
-              <w:rPr>
-                <w:rFonts w:ascii="Arial Nova" w:hAnsi="Arial Nova"/>
-              </w:rPr>
-              <w:t>}</w:t>
-            </w:r>
-          </w:p>
-          <w:p>
-            <w:pPr>
-              <w:rPr>
-                <w:rFonts w:ascii="Arial Nova" w:hAnsi="Arial Nova"/>
-              </w:rPr>
-            </w:pPr>
           </w:p>
           <w:p>
             <w:pPr>
@@ -4377,19 +4182,6 @@
                 <w:rFonts w:ascii="Arial Nova" w:hAnsi="Arial Nova"/>
               </w:rPr>
             </w:pPr>
-          </w:p>
-          <w:p>
-            <w:pPr>
-              <w:rPr>
-                <w:rFonts w:ascii="Arial Nova" w:hAnsi="Arial Nova"/>
-              </w:rPr>
-            </w:pPr>
-            <w:r>
-              <w:rPr>
-                <w:rFonts w:ascii="Arial Nova" w:hAnsi="Arial Nova"/>
-              </w:rPr>
-              <w:t>{additionalComments}</w:t>
-            </w:r>
           </w:p>
           <w:p>
             <w:pPr>
@@ -4594,13 +4386,7 @@
         </w:tc>
       </w:tr>
     </w:tbl>
-    <w:p>
-      <w:pPr>
-        <w:rPr>
-          <w:rFonts w:ascii="Arial Nova" w:hAnsi="Arial Nova"/>
-        </w:rPr>
-      </w:pPr>
-    </w:p>
+    <w:p/>
     <w:p/>
     <w:p/>
     <w:sectPr>

</xml_diff>